<commit_message>
Fix submission figure numbering and reformat supplements
</commit_message>
<xml_diff>
--- a/manuscripts/FIGURES_KFD_MJDYPV_Final.docx
+++ b/manuscripts/FIGURES_KFD_MJDYPV_Final.docx
@@ -44,7 +44,7 @@
               <a:graphicData uri="http://schemas.openxmlformats.org/drawingml/2006/picture">
                 <pic:pic>
                   <pic:nvPicPr>
-                    <pic:cNvPr id="0" name="figure1_discovery_cohorts.png"/>
+                    <pic:cNvPr id="0" name="figure1_submission.png"/>
                     <pic:cNvPicPr/>
                   </pic:nvPicPr>
                   <pic:blipFill>
@@ -83,7 +83,7 @@
       <w:r>
         <w:drawing>
           <wp:inline xmlns:a="http://schemas.openxmlformats.org/drawingml/2006/main" xmlns:pic="http://schemas.openxmlformats.org/drawingml/2006/picture">
-            <wp:extent cx="5486400" cy="4267200"/>
+            <wp:extent cx="5486400" cy="3962400"/>
             <wp:docPr id="2" name="Picture 2"/>
             <wp:cNvGraphicFramePr>
               <a:graphicFrameLocks noChangeAspect="1"/>
@@ -92,7 +92,7 @@
               <a:graphicData uri="http://schemas.openxmlformats.org/drawingml/2006/picture">
                 <pic:pic>
                   <pic:nvPicPr>
-                    <pic:cNvPr id="0" name="figure_v2_meta_priority.png"/>
+                    <pic:cNvPr id="0" name="figure2_submission.png"/>
                     <pic:cNvPicPr/>
                   </pic:nvPicPr>
                   <pic:blipFill>
@@ -104,7 +104,7 @@
                   <pic:spPr>
                     <a:xfrm>
                       <a:off x="0" y="0"/>
-                      <a:ext cx="5486400" cy="4267200"/>
+                      <a:ext cx="5486400" cy="3962400"/>
                     </a:xfrm>
                     <a:prstGeom prst="rect"/>
                   </pic:spPr>
@@ -131,7 +131,7 @@
       <w:r>
         <w:drawing>
           <wp:inline xmlns:a="http://schemas.openxmlformats.org/drawingml/2006/main" xmlns:pic="http://schemas.openxmlformats.org/drawingml/2006/picture">
-            <wp:extent cx="5486400" cy="3429000"/>
+            <wp:extent cx="5486400" cy="3650005"/>
             <wp:docPr id="3" name="Picture 3"/>
             <wp:cNvGraphicFramePr>
               <a:graphicFrameLocks noChangeAspect="1"/>
@@ -140,7 +140,7 @@
               <a:graphicData uri="http://schemas.openxmlformats.org/drawingml/2006/picture">
                 <pic:pic>
                   <pic:nvPicPr>
-                    <pic:cNvPr id="0" name="figure_v2_pathway_heterogeneity.png"/>
+                    <pic:cNvPr id="0" name="figure3_submission.png"/>
                     <pic:cNvPicPr/>
                   </pic:nvPicPr>
                   <pic:blipFill>
@@ -152,7 +152,7 @@
                   <pic:spPr>
                     <a:xfrm>
                       <a:off x="0" y="0"/>
-                      <a:ext cx="5486400" cy="3429000"/>
+                      <a:ext cx="5486400" cy="3650005"/>
                     </a:xfrm>
                     <a:prstGeom prst="rect"/>
                   </pic:spPr>
@@ -179,7 +179,7 @@
       <w:r>
         <w:drawing>
           <wp:inline xmlns:a="http://schemas.openxmlformats.org/drawingml/2006/main" xmlns:pic="http://schemas.openxmlformats.org/drawingml/2006/picture">
-            <wp:extent cx="5486400" cy="4267200"/>
+            <wp:extent cx="5486400" cy="3962400"/>
             <wp:docPr id="4" name="Picture 4"/>
             <wp:cNvGraphicFramePr>
               <a:graphicFrameLocks noChangeAspect="1"/>
@@ -188,7 +188,7 @@
               <a:graphicData uri="http://schemas.openxmlformats.org/drawingml/2006/picture">
                 <pic:pic>
                   <pic:nvPicPr>
-                    <pic:cNvPr id="0" name="figure2_target_ranking.png"/>
+                    <pic:cNvPr id="0" name="figure4_submission.png"/>
                     <pic:cNvPicPr/>
                   </pic:nvPicPr>
                   <pic:blipFill>
@@ -200,7 +200,7 @@
                   <pic:spPr>
                     <a:xfrm>
                       <a:off x="0" y="0"/>
-                      <a:ext cx="5486400" cy="4267200"/>
+                      <a:ext cx="5486400" cy="3962400"/>
                     </a:xfrm>
                     <a:prstGeom prst="rect"/>
                   </pic:spPr>

</xml_diff>